<commit_message>
feat: add 3D surface plot and boxplot visualizations to word report pipeline
</commit_message>
<xml_diff>
--- a/exercise_physiology_report.docx
+++ b/exercise_physiology_report.docx
@@ -209,7 +209,7 @@
         <w:pStyle w:val="Heading1"/>
       </w:pPr>
       <w:r>
-        <w:t>2. 통계 검정 및 논문 시각화 결과</w:t>
+        <w:t>2. 통계 검정 및 다변인 시각화 결과</w:t>
       </w:r>
     </w:p>
     <w:p>
@@ -346,6 +346,102 @@
                     <a:xfrm>
                       <a:off x="0" y="0"/>
                       <a:ext cx="5029200" cy="3592286"/>
+                    </a:xfrm>
+                    <a:prstGeom prst="rect"/>
+                  </pic:spPr>
+                </pic:pic>
+              </a:graphicData>
+            </a:graphic>
+          </wp:inline>
+        </w:drawing>
+      </w:r>
+    </w:p>
+    <w:p>
+      <w:pPr>
+        <w:pStyle w:val="ListBullet"/>
+      </w:pPr>
+      <w:r>
+        <w:t>Figure 4. 집단(Control vs Training) 및 시기(Pre vs Post)별 VO2max 분포 및 개별 피험자 산포도 (Boxplot + Stripplot)</w:t>
+      </w:r>
+    </w:p>
+    <w:p>
+      <w:pPr>
+        <w:spacing w:after="240"/>
+        <w:jc w:val="center"/>
+      </w:pPr>
+      <w:r>
+        <w:drawing>
+          <wp:inline xmlns:a="http://schemas.openxmlformats.org/drawingml/2006/main" xmlns:pic="http://schemas.openxmlformats.org/drawingml/2006/picture">
+            <wp:extent cx="5029200" cy="3143250"/>
+            <wp:docPr id="4" name="Picture 4"/>
+            <wp:cNvGraphicFramePr>
+              <a:graphicFrameLocks noChangeAspect="1"/>
+            </wp:cNvGraphicFramePr>
+            <a:graphic>
+              <a:graphicData uri="http://schemas.openxmlformats.org/drawingml/2006/picture">
+                <pic:pic>
+                  <pic:nvPicPr>
+                    <pic:cNvPr id="0" name="boxplot_figure.png"/>
+                    <pic:cNvPicPr/>
+                  </pic:nvPicPr>
+                  <pic:blipFill>
+                    <a:blip r:embed="rId12"/>
+                    <a:stretch>
+                      <a:fillRect/>
+                    </a:stretch>
+                  </pic:blipFill>
+                  <pic:spPr>
+                    <a:xfrm>
+                      <a:off x="0" y="0"/>
+                      <a:ext cx="5029200" cy="3143250"/>
+                    </a:xfrm>
+                    <a:prstGeom prst="rect"/>
+                  </pic:spPr>
+                </pic:pic>
+              </a:graphicData>
+            </a:graphic>
+          </wp:inline>
+        </w:drawing>
+      </w:r>
+    </w:p>
+    <w:p>
+      <w:pPr>
+        <w:pStyle w:val="ListBullet"/>
+      </w:pPr>
+      <w:r>
+        <w:t>Figure 5. VO2max, 혈중 젖산 농도 및 운동 수행 능력 지수 간의 다변인 3D 표면 반응 곡선 (3D Surface Response Plot)</w:t>
+      </w:r>
+    </w:p>
+    <w:p>
+      <w:pPr>
+        <w:spacing w:after="240"/>
+        <w:jc w:val="center"/>
+      </w:pPr>
+      <w:r>
+        <w:drawing>
+          <wp:inline xmlns:a="http://schemas.openxmlformats.org/drawingml/2006/main" xmlns:pic="http://schemas.openxmlformats.org/drawingml/2006/picture">
+            <wp:extent cx="5029200" cy="3771900"/>
+            <wp:docPr id="5" name="Picture 5"/>
+            <wp:cNvGraphicFramePr>
+              <a:graphicFrameLocks noChangeAspect="1"/>
+            </wp:cNvGraphicFramePr>
+            <a:graphic>
+              <a:graphicData uri="http://schemas.openxmlformats.org/drawingml/2006/picture">
+                <pic:pic>
+                  <pic:nvPicPr>
+                    <pic:cNvPr id="0" name="3d_surface_figure.png"/>
+                    <pic:cNvPicPr/>
+                  </pic:nvPicPr>
+                  <pic:blipFill>
+                    <a:blip r:embed="rId13"/>
+                    <a:stretch>
+                      <a:fillRect/>
+                    </a:stretch>
+                  </pic:blipFill>
+                  <pic:spPr>
+                    <a:xfrm>
+                      <a:off x="0" y="0"/>
+                      <a:ext cx="5029200" cy="3771900"/>
                     </a:xfrm>
                     <a:prstGeom prst="rect"/>
                   </pic:spPr>

</xml_diff>